<commit_message>
fix(templates): wrap literal {{синие переменные}} / {% маркеры %} in raw blocks
Header "ЛЕГЕНДА — как читать этот шаблон" в service_note_payment.docx
содержала литералы `{{синие переменные}}` и `{% маркеры %}`. Jinja2 пытался
парсить их как настоящие выражения и падал с
`TemplateSyntaxError: expected token 'end of print statement', got 'переменные'`
при генерации СЗ из закупки (#579 Цыганов).

Обернул оба в `{% raw %}…{% endraw %}` — легенда визуально сохраняется,
парсер пропускает токены как литералы. Локально rendering passes (docxtpl).

Co-Authored-By: Claude Opus 4.7 (1M context) <noreply@anthropic.com>
</commit_message>
<xml_diff>
--- a/backend/templates/service_note_payment.docx
+++ b/backend/templates/service_note_payment.docx
@@ -30,7 +30,7 @@
           <w:color w:val="1E40AF"/>
           <w:sz w:val="20"/>
         </w:rPr>
-        <w:t>{{синие переменные}}    — автоподстановка из БД</w:t>
+        <w:t>{% raw %}{{синие переменные}}{% endraw %}    — автоподстановка из БД</w:t>
       </w:r>
     </w:p>
     <w:p>
@@ -76,7 +76,7 @@
           <w:color w:val="6B7280"/>
           <w:sz w:val="20"/>
         </w:rPr>
-        <w:t>серые {% маркеры %}    — технические условия Jinja2 (не трогать)</w:t>
+        <w:t>серые {% raw %}{% маркеры %}{% endraw %}    — технические условия Jinja2 (не трогать)</w:t>
       </w:r>
     </w:p>
     <w:p>

</xml_diff>